<commit_message>
modification relation dataset et recherche
</commit_message>
<xml_diff>
--- a/Docs/cdc(v1).docx
+++ b/Docs/cdc(v1).docx
@@ -46,18 +46,7 @@
     </w:p>
     <w:p>
       <w:r>
-        <w:t xml:space="preserve">Les chercheurs et les étudiants de </w:t>
-      </w:r>
-      <w:r>
-        <w:t xml:space="preserve">The Peregrine </w:t>
-      </w:r>
-      <w:proofErr w:type="spellStart"/>
-      <w:r>
-        <w:t>Fund</w:t>
-      </w:r>
-      <w:proofErr w:type="spellEnd"/>
-      <w:r>
-        <w:t xml:space="preserve"> mènent des travaux sur la biodiversité, notamment l'étude des espèces de faune et de flore. Leurs données sont aujourd'hui éparpillées : tableurs, carnets papier, documents texte, ordinateurs personnels, clés USB ou pièces jointes d'e-mails, chacun les rangeant et les nommant à sa manière. Il est donc difficile de retrouver les données existantes sur une espèce, un site ou une période, de les comparer entre elles ou de les réutiliser pour de nouvelles recherches.</w:t>
+        <w:t>Les chercheurs et les étudiants de The Peregrine Fund mènent des travaux sur la biodiversité, notamment l'étude des espèces de faune et de flore. Leurs données sont aujourd'hui éparpillées : tableurs, carnets papier, documents texte, ordinateurs personnels, clés USB ou pièces jointes d'e-mails, chacun les rangeant et les nommant à sa manière. Il est donc difficile de retrouver les données existantes sur une espèce, un site ou une période, de les comparer entre elles ou de les réutiliser pour de nouvelles recherches.</w:t>
       </w:r>
     </w:p>
     <w:p>
@@ -235,31 +224,7 @@
         </w:numPr>
       </w:pPr>
       <w:r>
-        <w:t>ETL (</w:t>
-      </w:r>
-      <w:proofErr w:type="spellStart"/>
-      <w:r>
-        <w:t>Extract</w:t>
-      </w:r>
-      <w:proofErr w:type="spellEnd"/>
-      <w:r>
-        <w:t xml:space="preserve">, </w:t>
-      </w:r>
-      <w:proofErr w:type="spellStart"/>
-      <w:r>
-        <w:t>Transform</w:t>
-      </w:r>
-      <w:proofErr w:type="spellEnd"/>
-      <w:r>
-        <w:t xml:space="preserve">, </w:t>
-      </w:r>
-      <w:proofErr w:type="spellStart"/>
-      <w:r>
-        <w:t>Load</w:t>
-      </w:r>
-      <w:proofErr w:type="spellEnd"/>
-      <w:r>
-        <w:t>) pour optimiser et éviter les doublons de données</w:t>
+        <w:t>ETL (Extract, Transform, Load) pour optimiser et éviter les doublons de données</w:t>
       </w:r>
     </w:p>
     <w:p>
@@ -307,13 +272,8 @@
         </w:numPr>
       </w:pPr>
       <w:r>
-        <w:t xml:space="preserve">Historique des </w:t>
-      </w:r>
-      <w:proofErr w:type="spellStart"/>
-      <w:r>
-        <w:t>évenements</w:t>
-      </w:r>
-      <w:proofErr w:type="spellEnd"/>
+        <w:t>Historique des évenements</w:t>
+      </w:r>
     </w:p>
     <w:p/>
     <w:p>
@@ -424,21 +384,28 @@
         </w:numPr>
       </w:pPr>
       <w:r>
-        <w:t xml:space="preserve">Disposer d’un espace propre </w:t>
-      </w:r>
-      <w:proofErr w:type="spellStart"/>
-      <w:r>
-        <w:t>a</w:t>
-      </w:r>
-      <w:proofErr w:type="spellEnd"/>
-      <w:r>
-        <w:t xml:space="preserve"> chacun : chaque chercheur peu</w:t>
+        <w:t>Disposer d’un espace propre a chacun : chaque chercheur peu</w:t>
       </w:r>
       <w:r>
         <w:t>t</w:t>
       </w:r>
       <w:r>
         <w:t xml:space="preserve"> retrouver ses recherches et ses données</w:t>
+      </w:r>
+    </w:p>
+    <w:p>
+      <w:pPr>
+        <w:pStyle w:val="Paragraphedeliste"/>
+        <w:numPr>
+          <w:ilvl w:val="0"/>
+          <w:numId w:val="4"/>
+        </w:numPr>
+      </w:pPr>
+      <w:r>
+        <w:t>Possibili</w:t>
+      </w:r>
+      <w:r>
+        <w:t>te de saisi de donnees hors ligne</w:t>
       </w:r>
     </w:p>
     <w:p>
@@ -490,16 +457,7 @@
           <w:i/>
           <w:iCs/>
         </w:rPr>
-        <w:t>Chaque</w:t>
-      </w:r>
-      <w:r>
-        <w:rPr>
-          <w:b/>
-          <w:bCs/>
-          <w:i/>
-          <w:iCs/>
-        </w:rPr>
-        <w:t xml:space="preserve"> chercheur ou étudiant gère ses propres recherches et données. Elles ne sont visibles que par lui.</w:t>
+        <w:t>Chaque chercheur ou étudiant gère ses propres recherches et données. Elles ne sont visibles que par lui.</w:t>
       </w:r>
     </w:p>
     <w:p>
@@ -571,15 +529,7 @@
         </w:numPr>
       </w:pPr>
       <w:r>
-        <w:t xml:space="preserve">Importation de données : fichier </w:t>
-      </w:r>
-      <w:proofErr w:type="spellStart"/>
-      <w:r>
-        <w:t>excel</w:t>
-      </w:r>
-      <w:proofErr w:type="spellEnd"/>
-      <w:r>
-        <w:t xml:space="preserve"> ou csv : </w:t>
+        <w:t xml:space="preserve">Importation de données : fichier excel ou csv : </w:t>
       </w:r>
       <w:r>
         <w:t>ETL pour la fiabilité des données</w:t>
@@ -654,15 +604,7 @@
         </w:numPr>
       </w:pPr>
       <w:r>
-        <w:t xml:space="preserve">Espace thèse : </w:t>
-      </w:r>
-      <w:proofErr w:type="spellStart"/>
-      <w:r>
-        <w:t>upload</w:t>
-      </w:r>
-      <w:proofErr w:type="spellEnd"/>
-      <w:r>
-        <w:t xml:space="preserve"> de la thèse quand la recherche est terminée </w:t>
+        <w:t xml:space="preserve">Espace thèse : upload de la thèse quand la recherche est terminée </w:t>
       </w:r>
     </w:p>
     <w:p>
@@ -699,6 +641,18 @@
       </w:pPr>
       <w:r>
         <w:t>Note perso</w:t>
+      </w:r>
+    </w:p>
+    <w:p>
+      <w:pPr>
+        <w:pStyle w:val="Paragraphedeliste"/>
+        <w:numPr>
+          <w:ilvl w:val="0"/>
+          <w:numId w:val="6"/>
+        </w:numPr>
+      </w:pPr>
+      <w:r>
+        <w:t>Mode offline</w:t>
       </w:r>
     </w:p>
     <w:p>
@@ -736,16 +690,7 @@
           <w:i/>
           <w:iCs/>
         </w:rPr>
-        <w:t>L</w:t>
-      </w:r>
-      <w:r>
-        <w:rPr>
-          <w:b/>
-          <w:bCs/>
-          <w:i/>
-          <w:iCs/>
-        </w:rPr>
-        <w:t>es recherches et données que leurs auteurs choisissent de partager sont consultables par les autres utilisateurs de la plateforme.</w:t>
+        <w:t>Les recherches et données que leurs auteurs choisissent de partager sont consultables par les autres utilisateurs de la plateforme.</w:t>
       </w:r>
     </w:p>
     <w:p>
@@ -1002,15 +947,7 @@
           </w:tcPr>
           <w:p>
             <w:r>
-              <w:t xml:space="preserve">Robuste et adapté </w:t>
-            </w:r>
-            <w:proofErr w:type="spellStart"/>
-            <w:r>
-              <w:t>a</w:t>
-            </w:r>
-            <w:proofErr w:type="spellEnd"/>
-            <w:r>
-              <w:t xml:space="preserve"> une API</w:t>
+              <w:t>Robuste et adapté a une API</w:t>
             </w:r>
           </w:p>
         </w:tc>
@@ -1106,15 +1043,7 @@
           </w:tcPr>
           <w:p>
             <w:r>
-              <w:t xml:space="preserve">Gestion des comptes, </w:t>
-            </w:r>
-            <w:proofErr w:type="spellStart"/>
-            <w:r>
-              <w:t>roles</w:t>
-            </w:r>
-            <w:proofErr w:type="spellEnd"/>
-            <w:r>
-              <w:t>, accès privés et partagés</w:t>
+              <w:t>Gestion des comptes, roles, accès privés et partagés</w:t>
             </w:r>
           </w:p>
         </w:tc>
@@ -1135,11 +1064,9 @@
             <w:tcW w:w="2596" w:type="dxa"/>
           </w:tcPr>
           <w:p>
-            <w:proofErr w:type="spellStart"/>
             <w:r>
               <w:t>Minio</w:t>
             </w:r>
-            <w:proofErr w:type="spellEnd"/>
           </w:p>
         </w:tc>
         <w:tc>
@@ -1242,13 +1169,8 @@
             <w:tcW w:w="2596" w:type="dxa"/>
           </w:tcPr>
           <w:p>
-            <w:proofErr w:type="spellStart"/>
-            <w:r>
-              <w:t>WebSocket</w:t>
-            </w:r>
-            <w:proofErr w:type="spellEnd"/>
-            <w:r>
-              <w:t>/STOMP</w:t>
+            <w:r>
+              <w:t>WebSocket/STOMP</w:t>
             </w:r>
           </w:p>
         </w:tc>
@@ -1258,13 +1180,8 @@
           </w:tcPr>
           <w:p>
             <w:r>
-              <w:t xml:space="preserve">Notification de validation, collaboration, partage, </w:t>
-            </w:r>
-            <w:proofErr w:type="spellStart"/>
-            <w:r>
-              <w:t>etc</w:t>
-            </w:r>
-            <w:proofErr w:type="spellEnd"/>
+              <w:t>Notification de validation, collaboration, partage, etc</w:t>
+            </w:r>
           </w:p>
         </w:tc>
       </w:tr>
@@ -1316,19 +1233,9 @@
             <w:tcW w:w="2596" w:type="dxa"/>
           </w:tcPr>
           <w:p>
-            <w:proofErr w:type="spellStart"/>
-            <w:r>
-              <w:t>Swagger</w:t>
-            </w:r>
-            <w:proofErr w:type="spellEnd"/>
-            <w:r>
-              <w:t>/</w:t>
-            </w:r>
-            <w:proofErr w:type="spellStart"/>
-            <w:r>
-              <w:t>OpenAPI</w:t>
-            </w:r>
-            <w:proofErr w:type="spellEnd"/>
+            <w:r>
+              <w:t>Swagger/OpenAPI</w:t>
+            </w:r>
           </w:p>
         </w:tc>
         <w:tc>
@@ -1337,13 +1244,8 @@
           </w:tcPr>
           <w:p>
             <w:r>
-              <w:t xml:space="preserve">Documentation et test des </w:t>
-            </w:r>
-            <w:proofErr w:type="spellStart"/>
-            <w:r>
-              <w:t>endpoints</w:t>
-            </w:r>
-            <w:proofErr w:type="spellEnd"/>
+              <w:t>Documentation et test des endpoints</w:t>
+            </w:r>
           </w:p>
         </w:tc>
       </w:tr>
@@ -1385,11 +1287,9 @@
             <w:tcW w:w="2122" w:type="dxa"/>
           </w:tcPr>
           <w:p>
-            <w:proofErr w:type="spellStart"/>
             <w:r>
               <w:t>Versionnement</w:t>
             </w:r>
-            <w:proofErr w:type="spellEnd"/>
           </w:p>
         </w:tc>
         <w:tc>

</xml_diff>